<commit_message>
add OpenMC rectangular-rod reference: identical-geometry keff + pin fission comparison (Figure 5, Table 3 rect-rod rows)
</commit_message>
<xml_diff>
--- a/paper/main.docx
+++ b/paper/main.docx
@@ -791,13 +791,36 @@
         </m:r>
       </m:oMath>
       <w:r>
-        <w:t xml:space="preserve">, inside the Monte Carlo standard error, and the</w:t>
-      </w:r>
-      <w:r>
-        <w:t xml:space="preserve"> </w:t>
-      </w:r>
-      <w:r>
-        <w:t xml:space="preserve">pin-averaged fission-rate maps agree with OpenMC at the sub-1% RMS level.</w:t>
+        <w:t xml:space="preserve">, and</w:t>
+      </w:r>
+      <w:r>
+        <w:t xml:space="preserve"> </w:t>
+      </w:r>
+      <m:oMath>
+        <m:r>
+          <m:rPr>
+            <m:sty m:val="p"/>
+          </m:rPr>
+          <m:t>−</m:t>
+        </m:r>
+        <m:r>
+          <m:t>61.1</m:t>
+        </m:r>
+      </m:oMath>
+      <w:r>
+        <w:t xml:space="preserve"> pcm against the identical</w:t>
+      </w:r>
+      <w:r>
+        <w:t xml:space="preserve"> </w:t>
+      </w:r>
+      <w:r>
+        <w:t xml:space="preserve">rectangular-rod OpenMC geometry; the pin-averaged fission-rate maps agree</w:t>
+      </w:r>
+      <w:r>
+        <w:t xml:space="preserve"> </w:t>
+      </w:r>
+      <w:r>
+        <w:t xml:space="preserve">with OpenMC at the sub-1% RMS level on both geometries.</w:t>
       </w:r>
       <w:r>
         <w:t xml:space="preserve"> </w:t>
@@ -3063,7 +3086,7 @@
       </w:r>
     </w:p>
     <w:bookmarkEnd w:id="14"/>
-    <w:bookmarkStart w:id="46" w:name="c5g7-mox-benchmark"/>
+    <w:bookmarkStart w:id="52" w:name="c5g7-mox-benchmark"/>
     <w:p>
       <w:pPr>
         <w:pStyle w:val="Heading1"/>
@@ -8508,7 +8531,7 @@
     <w:bookmarkEnd w:id="28"/>
     <w:bookmarkEnd w:id="29"/>
     <w:bookmarkEnd w:id="30"/>
-    <w:bookmarkStart w:id="43" w:name="X2117ea23a981841fcde4df53d83462f658246b1"/>
+    <w:bookmarkStart w:id="49" w:name="X2117ea23a981841fcde4df53d83462f658246b1"/>
     <w:p>
       <w:pPr>
         <w:pStyle w:val="Heading2"/>
@@ -9334,7 +9357,13 @@
         <w:t xml:space="preserve"> </w:t>
       </w:r>
       <w:r>
-        <w:t xml:space="preserve">OpenMC explicit-geometry (fuel circle</w:t>
+        <w:t xml:space="preserve">OpenMC explicit-geometry runs on the same un-homogenised data — fuel</w:t>
+      </w:r>
+      <w:r>
+        <w:t xml:space="preserve"> </w:t>
+      </w:r>
+      <w:r>
+        <w:t xml:space="preserve">circle</w:t>
       </w:r>
       <w:r>
         <w:t xml:space="preserve"> </w:t>
@@ -9351,13 +9380,13 @@
         <w:t xml:space="preserve"> </w:t>
       </w:r>
       <w:r>
-        <w:t xml:space="preserve">water annulus) runs on the same</w:t>
-      </w:r>
-      <w:r>
-        <w:t xml:space="preserve"> </w:t>
-      </w:r>
-      <w:r>
-        <w:t xml:space="preserve">un-homogenised data, the high-fidelity reference</w:t>
+        <w:t xml:space="preserve">water annulus, and the identical rectangular-rod geometry of the</w:t>
+      </w:r>
+      <w:r>
+        <w:t xml:space="preserve"> </w:t>
+      </w:r>
+      <w:r>
+        <w:t xml:space="preserve">PSN nodes — the high-fidelity reference</w:t>
       </w:r>
       <w:r>
         <w:t xml:space="preserve"> </w:t>
@@ -9395,7 +9424,7 @@
         <w:tblStyle w:val="Table"/>
         <w:tblW w:type="auto" w:w="0"/>
         <w:tblLook w:firstRow="1" w:lastRow="0" w:firstColumn="0" w:lastColumn="0" w:noHBand="0" w:noVBand="0" w:val="0020"/>
-        <w:tblCaption w:val="Rectangular-node OpenPSN (un-homogenised material XS). \Delta in pcm versus the explicitly noted reference. References: the directly computed OpenMC explicit-geometry (fuel circle + water annulus) runs on the same un-homogenised data, the high-fidelity reference 1.18646 of McGraw et al. , and nTRACER (SPHINCS)."/>
+        <w:tblCaption w:val="Rectangular-node OpenPSN (un-homogenised material XS). \Delta in pcm versus the explicitly noted reference. References: the directly computed OpenMC explicit-geometry runs on the same un-homogenised data — fuel circle + water annulus, and the identical rectangular-rod geometry of the PSN nodes — the high-fidelity reference 1.18646 of McGraw et al. , and nTRACER (SPHINCS)."/>
       </w:tblPr>
       <w:tblGrid>
         <w:gridCol w:w="1980"/>
@@ -9779,6 +9808,108 @@
               <w:t xml:space="preserve"> </w:t>
             </w:r>
             <w:r>
+              <w:t xml:space="preserve">vs OpenMC, rect. rods (</w:t>
+            </w:r>
+            <m:oMath>
+              <m:r>
+                <m:t>1.3347260</m:t>
+              </m:r>
+            </m:oMath>
+            <w:r>
+              <w:t xml:space="preserve">)</w:t>
+            </w:r>
+          </w:p>
+        </w:tc>
+        <w:tc>
+          <w:tcPr/>
+          <w:p>
+            <w:pPr>
+              <w:pStyle w:val="Compact"/>
+              <w:jc w:val="right"/>
+            </w:pPr>
+            <m:oMath>
+              <m:r>
+                <m:rPr>
+                  <m:sty m:val="p"/>
+                </m:rPr>
+                <m:t>−</m:t>
+              </m:r>
+              <m:r>
+                <m:t>101.0</m:t>
+              </m:r>
+            </m:oMath>
+            <w:r>
+              <w:t xml:space="preserve">​</w:t>
+            </w:r>
+          </w:p>
+        </w:tc>
+        <w:tc>
+          <w:tcPr/>
+          <w:p>
+            <w:pPr>
+              <w:pStyle w:val="Compact"/>
+              <w:jc w:val="right"/>
+            </w:pPr>
+            <m:oMath>
+              <m:r>
+                <m:rPr>
+                  <m:sty m:val="p"/>
+                </m:rPr>
+                <m:t>−</m:t>
+              </m:r>
+              <m:r>
+                <m:t>69.3</m:t>
+              </m:r>
+            </m:oMath>
+            <w:r>
+              <w:t xml:space="preserve">​</w:t>
+            </w:r>
+          </w:p>
+        </w:tc>
+        <w:tc>
+          <w:tcPr/>
+          <w:p>
+            <w:pPr>
+              <w:pStyle w:val="Compact"/>
+              <w:jc w:val="right"/>
+            </w:pPr>
+            <m:oMath>
+              <m:r>
+                <m:rPr>
+                  <m:sty m:val="p"/>
+                </m:rPr>
+                <m:t>−</m:t>
+              </m:r>
+              <m:r>
+                <m:t>37.2</m:t>
+              </m:r>
+            </m:oMath>
+            <w:r>
+              <w:t xml:space="preserve">​</w:t>
+            </w:r>
+          </w:p>
+        </w:tc>
+      </w:tr>
+      <w:tr>
+        <w:tc>
+          <w:tcPr/>
+          <w:p>
+            <w:pPr>
+              <w:pStyle w:val="Compact"/>
+              <w:jc w:val="left"/>
+            </w:pPr>
+            <m:oMath>
+              <m:r>
+                <m:rPr>
+                  <m:sty m:val="p"/>
+                </m:rPr>
+                <m:t>Δ</m:t>
+              </m:r>
+            </m:oMath>
+            <w:r>
+              <w:t xml:space="preserve"> </w:t>
+            </w:r>
+            <w:r>
               <w:t xml:space="preserve">vs nTRACER (</w:t>
             </w:r>
             <m:oMath>
@@ -10118,6 +10249,108 @@
               <w:t xml:space="preserve"> </w:t>
             </w:r>
             <w:r>
+              <w:t xml:space="preserve">vs OpenMC, rect. rods (</w:t>
+            </w:r>
+            <m:oMath>
+              <m:r>
+                <m:t>1.1872176</m:t>
+              </m:r>
+            </m:oMath>
+            <w:r>
+              <w:t xml:space="preserve">)</w:t>
+            </w:r>
+          </w:p>
+        </w:tc>
+        <w:tc>
+          <w:tcPr/>
+          <w:p>
+            <w:pPr>
+              <w:pStyle w:val="Compact"/>
+              <w:jc w:val="right"/>
+            </w:pPr>
+            <m:oMath>
+              <m:r>
+                <m:rPr>
+                  <m:sty m:val="p"/>
+                </m:rPr>
+                <m:t>−</m:t>
+              </m:r>
+              <m:r>
+                <m:t>184.3</m:t>
+              </m:r>
+            </m:oMath>
+            <w:r>
+              <w:t xml:space="preserve">​</w:t>
+            </w:r>
+          </w:p>
+        </w:tc>
+        <w:tc>
+          <w:tcPr/>
+          <w:p>
+            <w:pPr>
+              <w:pStyle w:val="Compact"/>
+              <w:jc w:val="right"/>
+            </w:pPr>
+            <m:oMath>
+              <m:r>
+                <m:rPr>
+                  <m:sty m:val="p"/>
+                </m:rPr>
+                <m:t>−</m:t>
+              </m:r>
+              <m:r>
+                <m:t>110.9</m:t>
+              </m:r>
+            </m:oMath>
+            <w:r>
+              <w:t xml:space="preserve">​</w:t>
+            </w:r>
+          </w:p>
+        </w:tc>
+        <w:tc>
+          <w:tcPr/>
+          <w:p>
+            <w:pPr>
+              <w:pStyle w:val="Compact"/>
+              <w:jc w:val="right"/>
+            </w:pPr>
+            <m:oMath>
+              <m:r>
+                <m:rPr>
+                  <m:sty m:val="p"/>
+                </m:rPr>
+                <m:t>−</m:t>
+              </m:r>
+              <m:r>
+                <m:t>61.1</m:t>
+              </m:r>
+            </m:oMath>
+            <w:r>
+              <w:t xml:space="preserve">​</w:t>
+            </w:r>
+          </w:p>
+        </w:tc>
+      </w:tr>
+      <w:tr>
+        <w:tc>
+          <w:tcPr/>
+          <w:p>
+            <w:pPr>
+              <w:pStyle w:val="Compact"/>
+              <w:jc w:val="left"/>
+            </w:pPr>
+            <m:oMath>
+              <m:r>
+                <m:rPr>
+                  <m:sty m:val="p"/>
+                </m:rPr>
+                <m:t>Δ</m:t>
+              </m:r>
+            </m:oMath>
+            <w:r>
+              <w:t xml:space="preserve"> </w:t>
+            </w:r>
+            <w:r>
               <w:t xml:space="preserve">vs McGraw high-fidelity (</w:t>
             </w:r>
             <m:oMath>
@@ -10309,7 +10542,7 @@
         <w:pStyle w:val="BodyText"/>
       </w:pPr>
       <w:r>
-        <w:t xml:space="preserve">On the 1/4 core the eigenvalue climbs monotonically into the reference:</w:t>
+        <w:t xml:space="preserve">On the 1/4 core the eigenvalue climbs monotonically toward the reference:</w:t>
       </w:r>
       <w:r>
         <w:t xml:space="preserve"> </w:t>
@@ -10417,13 +10650,33 @@
         <w:t xml:space="preserve"> </w:t>
       </w:r>
       <w:r>
-        <w:t xml:space="preserve">inside the OpenMC</w:t>
-      </w:r>
-      <w:r>
-        <w:t xml:space="preserve"> </w:t>
-      </w:r>
-      <w:r>
-        <w:t xml:space="preserve">standard error (</w:t>
+        <w:t xml:space="preserve">at</w:t>
+      </w:r>
+      <w:r>
+        <w:t xml:space="preserve"> </w:t>
+      </w:r>
+      <m:oMath>
+        <m:r>
+          <m:rPr>
+            <m:sty m:val="p"/>
+          </m:rPr>
+          <m:t>∼</m:t>
+        </m:r>
+        <m:r>
+          <m:t>3</m:t>
+        </m:r>
+      </m:oMath>
+      <w:r>
+        <w:t xml:space="preserve"> </w:t>
+      </w:r>
+      <w:r>
+        <w:t xml:space="preserve">of the OpenMC standard</w:t>
+      </w:r>
+      <w:r>
+        <w:t xml:space="preserve"> </w:t>
+      </w:r>
+      <w:r>
+        <w:t xml:space="preserve">error (</w:t>
       </w:r>
       <m:oMath>
         <m:r>
@@ -10471,25 +10724,94 @@
         </m:r>
       </m:oMath>
       <w:r>
-        <w:t xml:space="preserve">. This is the cleanest statement of what the method can</w:t>
-      </w:r>
-      <w:r>
-        <w:t xml:space="preserve"> </w:t>
-      </w:r>
-      <w:r>
-        <w:t xml:space="preserve">do: with the homogenisation model removed, the residual of the nodal PSN</w:t>
-      </w:r>
-      <w:r>
-        <w:t xml:space="preserve"> </w:t>
-      </w:r>
-      <w:r>
-        <w:t xml:space="preserve">solution against a high-fidelity explicit-geometry transport calculation</w:t>
-      </w:r>
-      <w:r>
-        <w:t xml:space="preserve"> </w:t>
-      </w:r>
-      <w:r>
-        <w:t xml:space="preserve">is at the level of the Monte Carlo statistics. (The assembly</w:t>
+        <w:t xml:space="preserve">. Against the OpenMC run on the identical</w:t>
+      </w:r>
+      <w:r>
+        <w:t xml:space="preserve"> </w:t>
+      </w:r>
+      <w:r>
+        <w:t xml:space="preserve">rectangular-rod geometry (Section </w:t>
+      </w:r>
+      <w:hyperlink w:anchor="sec:rectref">
+        <w:r>
+          <w:rPr>
+            <w:rStyle w:val="Hyperlink"/>
+          </w:rPr>
+          <w:t xml:space="preserve">[sec:rectref]</w:t>
+        </w:r>
+      </w:hyperlink>
+      <w:r>
+        <w:t xml:space="preserve">,</w:t>
+      </w:r>
+      <w:r>
+        <w:t xml:space="preserve"> </w:t>
+      </w:r>
+      <w:r>
+        <w:t xml:space="preserve">Figure </w:t>
+      </w:r>
+      <w:hyperlink w:anchor="fig:rectflux">
+        <w:r>
+          <w:rPr>
+            <w:rStyle w:val="Hyperlink"/>
+          </w:rPr>
+          <w:t xml:space="preserve">5</w:t>
+        </w:r>
+      </w:hyperlink>
+      <w:r>
+        <w:t xml:space="preserve">) the same sweep reads</w:t>
+      </w:r>
+      <w:r>
+        <w:t xml:space="preserve"> </w:t>
+      </w:r>
+      <m:oMath>
+        <m:r>
+          <m:rPr>
+            <m:sty m:val="p"/>
+          </m:rPr>
+          <m:t>−</m:t>
+        </m:r>
+        <m:r>
+          <m:t>184.3</m:t>
+        </m:r>
+        <m:r>
+          <m:rPr>
+            <m:sty m:val="p"/>
+          </m:rPr>
+          <m:t>→</m:t>
+        </m:r>
+        <m:r>
+          <m:rPr>
+            <m:sty m:val="p"/>
+          </m:rPr>
+          <m:t>−</m:t>
+        </m:r>
+        <m:r>
+          <m:t>110.9</m:t>
+        </m:r>
+        <m:r>
+          <m:rPr>
+            <m:sty m:val="p"/>
+          </m:rPr>
+          <m:t>→</m:t>
+        </m:r>
+        <m:r>
+          <m:rPr>
+            <m:sty m:val="p"/>
+          </m:rPr>
+          <m:t>−</m:t>
+        </m:r>
+        <m:r>
+          <m:t>61.1</m:t>
+        </m:r>
+      </m:oMath>
+      <w:r>
+        <w:t xml:space="preserve"> pcm: still monotonically</w:t>
+      </w:r>
+      <w:r>
+        <w:t xml:space="preserve"> </w:t>
+      </w:r>
+      <w:r>
+        <w:t xml:space="preserve">decreasing, so at</w:t>
       </w:r>
       <w:r>
         <w:t xml:space="preserve"> </w:t>
@@ -10498,6 +10820,35 @@
         <m:r>
           <m:t>M</m:t>
         </m:r>
+        <m:r>
+          <m:rPr>
+            <m:sty m:val="p"/>
+          </m:rPr>
+          <m:t>=</m:t>
+        </m:r>
+        <m:r>
+          <m:t>16</m:t>
+        </m:r>
+      </m:oMath>
+      <w:r>
+        <w:t xml:space="preserve"> </w:t>
+      </w:r>
+      <w:r>
+        <w:t xml:space="preserve">the angular-moment closure, not the square</w:t>
+      </w:r>
+      <w:r>
+        <w:t xml:space="preserve"> </w:t>
+      </w:r>
+      <w:r>
+        <w:t xml:space="preserve">tiling, is what sets the residual. (The assembly</w:t>
+      </w:r>
+      <w:r>
+        <w:t xml:space="preserve"> </w:t>
+      </w:r>
+      <m:oMath>
+        <m:r>
+          <m:t>M</m:t>
+        </m:r>
       </m:oMath>
       <w:r>
         <w:t xml:space="preserve"> </w:t>
@@ -10546,11 +10897,11 @@
         <w:t xml:space="preserve"> </w:t>
       </w:r>
       <w:r>
-        <w:t xml:space="preserve">vacuum edges, converges on the reference instead.)</w:t>
+        <w:t xml:space="preserve">vacuum edges, converges toward the reference instead.)</w:t>
       </w:r>
     </w:p>
     <w:bookmarkEnd w:id="37"/>
-    <w:bookmarkStart w:id="42" w:name="flux-comparison-explicit-geometry."/>
+    <w:bookmarkStart w:id="43" w:name="flux-comparison-explicit-geometry."/>
     <w:p>
       <w:pPr>
         <w:pStyle w:val="Heading4"/>
@@ -11381,15 +11732,21 @@
       </w:r>
     </w:p>
     <w:bookmarkEnd w:id="41"/>
-    <w:bookmarkEnd w:id="42"/>
-    <w:bookmarkEnd w:id="43"/>
-    <w:bookmarkStart w:id="45" w:name="X5dff4020ce9d23d2cf92dde8b6a9f5e78dfe609"/>
     <w:p>
       <w:pPr>
-        <w:pStyle w:val="Heading2"/>
+        <w:pStyle w:val="BodyText"/>
       </w:pPr>
-      <w:r>
-        <w:t xml:space="preserve">Comparison with the published diffusion / SN / nodal landscape</w:t>
+      <w:bookmarkStart w:id="42" w:name="sec:rectref"/>
+      <w:bookmarkEnd w:id="42"/>
+    </w:p>
+    <w:bookmarkEnd w:id="43"/>
+    <w:bookmarkStart w:id="48" w:name="rectangular-rod-reference."/>
+    <w:p>
+      <w:pPr>
+        <w:pStyle w:val="Heading4"/>
+      </w:pPr>
+      <w:r>
+        <w:t xml:space="preserve">Rectangular-rod reference.</w:t>
       </w:r>
     </w:p>
     <w:p>
@@ -11397,54 +11754,99 @@
         <w:pStyle w:val="FirstParagraph"/>
       </w:pPr>
       <w:r>
-        <w:t xml:space="preserve">The original NEA report </w:t>
-      </w:r>
-      <w:r>
-        <w:t xml:space="preserve"> </w:t>
-      </w:r>
-      <w:r>
-        <w:t xml:space="preserve">tabulates 20 deterministic codes on</w:t>
-      </w:r>
-      <w:r>
-        <w:t xml:space="preserve"> </w:t>
-      </w:r>
-      <w:r>
-        <w:t xml:space="preserve">C5G7-2D. Table </w:t>
-      </w:r>
-      <w:hyperlink w:anchor="tab:lit">
-        <w:r>
-          <w:rPr>
-            <w:rStyle w:val="Hyperlink"/>
-          </w:rPr>
-          <w:t xml:space="preserve">4</w:t>
-        </w:r>
-      </w:hyperlink>
-      <w:r>
-        <w:t xml:space="preserve"> </w:t>
-      </w:r>
-      <w:r>
-        <w:t xml:space="preserve">reproduces the diffusion- and nodal-family</w:t>
-      </w:r>
-      <w:r>
-        <w:t xml:space="preserve"> </w:t>
-      </w:r>
-      <w:r>
-        <w:t xml:space="preserve">values we could extract from it, together with recent P1/SP3/SN/nodal</w:t>
-      </w:r>
-      <w:r>
-        <w:t xml:space="preserve"> </w:t>
-      </w:r>
-      <w:r>
-        <w:t xml:space="preserve">literature results and our own OpenPSN result.</w:t>
-      </w:r>
-    </w:p>
-    <w:bookmarkStart w:id="44" w:name="tab:lit"/>
-    <w:p>
-      <w:pPr>
-        <w:pStyle w:val="TableCaption"/>
-      </w:pPr>
-      <w:r>
-        <w:t xml:space="preserve">C5G7-2D</w:t>
+        <w:t xml:space="preserve"> </w:t>
+      </w:r>
+      <w:r>
+        <w:t xml:space="preserve">The circular pin cell is the benchmark’s reference geometry, while the PSN</w:t>
+      </w:r>
+      <w:r>
+        <w:t xml:space="preserve"> </w:t>
+      </w:r>
+      <w:r>
+        <w:t xml:space="preserve">nodes tile the same cell with an equal-area square fuel block (side</w:t>
+      </w:r>
+      <w:r>
+        <w:t xml:space="preserve"> </w:t>
+      </w:r>
+      <m:oMath>
+        <m:r>
+          <m:t>0.9571</m:t>
+        </m:r>
+      </m:oMath>
+      <w:r>
+        <w:t xml:space="preserve"> cm, water gap</w:t>
+      </w:r>
+      <w:r>
+        <w:t xml:space="preserve"> </w:t>
+      </w:r>
+      <m:oMath>
+        <m:r>
+          <m:t>0.1514</m:t>
+        </m:r>
+      </m:oMath>
+      <w:r>
+        <w:t xml:space="preserve"> cm). To separate the geometric effect from</w:t>
+      </w:r>
+      <w:r>
+        <w:t xml:space="preserve"> </w:t>
+      </w:r>
+      <w:r>
+        <w:t xml:space="preserve">the method difference we run OpenMC on exactly that rectangular-rod geometry</w:t>
+      </w:r>
+      <w:r>
+        <w:t xml:space="preserve"> </w:t>
+      </w:r>
+      <w:r>
+        <w:t xml:space="preserve">(same un-homogenised data, same collision-estimator pin tallies,</w:t>
+      </w:r>
+      <w:r>
+        <w:t xml:space="preserve"> </w:t>
+      </w:r>
+      <m:oMath>
+        <m:r>
+          <m:t>20200</m:t>
+        </m:r>
+      </m:oMath>
+      <w:r>
+        <w:t xml:space="preserve"> </w:t>
+      </w:r>
+      <w:r>
+        <w:t xml:space="preserve">batches</w:t>
+      </w:r>
+      <w:r>
+        <w:t xml:space="preserve"> </w:t>
+      </w:r>
+      <m:oMath>
+        <m:r>
+          <m:rPr>
+            <m:sty m:val="p"/>
+          </m:rPr>
+          <m:t>×</m:t>
+        </m:r>
+        <m:sSup>
+          <m:e>
+            <m:r>
+              <m:t>10</m:t>
+            </m:r>
+          </m:e>
+          <m:sup>
+            <m:r>
+              <m:t>5</m:t>
+            </m:r>
+          </m:sup>
+        </m:sSup>
+      </m:oMath>
+      <w:r>
+        <w:t xml:space="preserve"> </w:t>
+      </w:r>
+      <w:r>
+        <w:t xml:space="preserve">particles, fixed seed). The square-rod assembly</w:t>
+      </w:r>
+      <w:r>
+        <w:t xml:space="preserve"> </w:t>
+      </w:r>
+      <w:r>
+        <w:t xml:space="preserve">returns</w:t>
       </w:r>
       <w:r>
         <w:t xml:space="preserve"> </w:t>
@@ -11477,6 +11879,861 @@
             </m:r>
           </m:sub>
         </m:sSub>
+        <m:r>
+          <m:rPr>
+            <m:sty m:val="p"/>
+          </m:rPr>
+          <m:t>=</m:t>
+        </m:r>
+        <m:r>
+          <m:t>1.3347260</m:t>
+        </m:r>
+      </m:oMath>
+      <w:r>
+        <w:t xml:space="preserve"> </w:t>
+      </w:r>
+      <w:r>
+        <w:t xml:space="preserve">(</w:t>
+      </w:r>
+      <m:oMath>
+        <m:r>
+          <m:rPr>
+            <m:sty m:val="p"/>
+          </m:rPr>
+          <m:t>±</m:t>
+        </m:r>
+        <m:r>
+          <m:t>3.6</m:t>
+        </m:r>
+      </m:oMath>
+      <w:r>
+        <w:t xml:space="preserve"> pcm) and the 1/4 core</w:t>
+      </w:r>
+      <w:r>
+        <w:t xml:space="preserve"> </w:t>
+      </w:r>
+      <m:oMath>
+        <m:r>
+          <m:t>1.1872176</m:t>
+        </m:r>
+      </m:oMath>
+      <w:r>
+        <w:t xml:space="preserve"> </w:t>
+      </w:r>
+      <w:r>
+        <w:t xml:space="preserve">(</w:t>
+      </w:r>
+      <m:oMath>
+        <m:r>
+          <m:rPr>
+            <m:sty m:val="p"/>
+          </m:rPr>
+          <m:t>±</m:t>
+        </m:r>
+        <m:r>
+          <m:t>3.4</m:t>
+        </m:r>
+      </m:oMath>
+      <w:r>
+        <w:t xml:space="preserve"> pcm):</w:t>
+      </w:r>
+      <w:r>
+        <w:t xml:space="preserve"> </w:t>
+      </w:r>
+      <m:oMath>
+        <m:r>
+          <m:rPr>
+            <m:sty m:val="p"/>
+          </m:rPr>
+          <m:t>+</m:t>
+        </m:r>
+        <m:r>
+          <m:t>123</m:t>
+        </m:r>
+      </m:oMath>
+      <w:r>
+        <w:t xml:space="preserve"> </w:t>
+      </w:r>
+      <w:r>
+        <w:t xml:space="preserve">and</w:t>
+      </w:r>
+      <w:r>
+        <w:t xml:space="preserve"> </w:t>
+      </w:r>
+      <m:oMath>
+        <m:r>
+          <m:rPr>
+            <m:sty m:val="p"/>
+          </m:rPr>
+          <m:t>+</m:t>
+        </m:r>
+        <m:r>
+          <m:t>72</m:t>
+        </m:r>
+      </m:oMath>
+      <w:r>
+        <w:t xml:space="preserve"> pcm above the cylindrical</w:t>
+      </w:r>
+      <w:r>
+        <w:t xml:space="preserve"> </w:t>
+      </w:r>
+      <w:r>
+        <w:t xml:space="preserve">reference of Table </w:t>
+      </w:r>
+      <w:hyperlink w:anchor="tab:rect">
+        <w:r>
+          <w:rPr>
+            <w:rStyle w:val="Hyperlink"/>
+          </w:rPr>
+          <w:t xml:space="preserve">3</w:t>
+        </w:r>
+      </w:hyperlink>
+      <w:r>
+        <w:t xml:space="preserve"> </w:t>
+      </w:r>
+      <w:r>
+        <w:t xml:space="preserve">— the pure geometry effect of the</w:t>
+      </w:r>
+      <w:r>
+        <w:t xml:space="preserve"> </w:t>
+      </w:r>
+      <w:r>
+        <w:t xml:space="preserve">square tiling on the same data. Against the rectangular-rod reference the</w:t>
+      </w:r>
+      <w:r>
+        <w:t xml:space="preserve"> </w:t>
+      </w:r>
+      <m:oMath>
+        <m:r>
+          <m:t>M</m:t>
+        </m:r>
+      </m:oMath>
+      <w:r>
+        <w:t xml:space="preserve"> </w:t>
+      </w:r>
+      <w:r>
+        <w:t xml:space="preserve">sweep is</w:t>
+      </w:r>
+      <w:r>
+        <w:t xml:space="preserve"> </w:t>
+      </w:r>
+      <m:oMath>
+        <m:r>
+          <m:rPr>
+            <m:sty m:val="p"/>
+          </m:rPr>
+          <m:t>−</m:t>
+        </m:r>
+        <m:r>
+          <m:t>101.0</m:t>
+        </m:r>
+        <m:r>
+          <m:rPr>
+            <m:sty m:val="p"/>
+          </m:rPr>
+          <m:t>→</m:t>
+        </m:r>
+        <m:r>
+          <m:rPr>
+            <m:sty m:val="p"/>
+          </m:rPr>
+          <m:t>−</m:t>
+        </m:r>
+        <m:r>
+          <m:t>69.3</m:t>
+        </m:r>
+        <m:r>
+          <m:rPr>
+            <m:sty m:val="p"/>
+          </m:rPr>
+          <m:t>→</m:t>
+        </m:r>
+        <m:r>
+          <m:rPr>
+            <m:sty m:val="p"/>
+          </m:rPr>
+          <m:t>−</m:t>
+        </m:r>
+        <m:r>
+          <m:t>37.2</m:t>
+        </m:r>
+      </m:oMath>
+      <w:r>
+        <w:t xml:space="preserve"> pcm on the</w:t>
+      </w:r>
+      <w:r>
+        <w:t xml:space="preserve"> </w:t>
+      </w:r>
+      <w:r>
+        <w:t xml:space="preserve">assembly and</w:t>
+      </w:r>
+      <w:r>
+        <w:t xml:space="preserve"> </w:t>
+      </w:r>
+      <m:oMath>
+        <m:r>
+          <m:rPr>
+            <m:sty m:val="p"/>
+          </m:rPr>
+          <m:t>−</m:t>
+        </m:r>
+        <m:r>
+          <m:t>184.3</m:t>
+        </m:r>
+        <m:r>
+          <m:rPr>
+            <m:sty m:val="p"/>
+          </m:rPr>
+          <m:t>→</m:t>
+        </m:r>
+        <m:r>
+          <m:rPr>
+            <m:sty m:val="p"/>
+          </m:rPr>
+          <m:t>−</m:t>
+        </m:r>
+        <m:r>
+          <m:t>110.9</m:t>
+        </m:r>
+        <m:r>
+          <m:rPr>
+            <m:sty m:val="p"/>
+          </m:rPr>
+          <m:t>→</m:t>
+        </m:r>
+        <m:r>
+          <m:rPr>
+            <m:sty m:val="p"/>
+          </m:rPr>
+          <m:t>−</m:t>
+        </m:r>
+        <m:r>
+          <m:t>61.1</m:t>
+        </m:r>
+      </m:oMath>
+      <w:r>
+        <w:t xml:space="preserve"> pcm on the</w:t>
+      </w:r>
+      <w:r>
+        <w:t xml:space="preserve"> </w:t>
+      </w:r>
+      <w:r>
+        <w:t xml:space="preserve">1/4 core: monotonically decreasing with</w:t>
+      </w:r>
+      <w:r>
+        <w:t xml:space="preserve"> </w:t>
+      </w:r>
+      <m:oMath>
+        <m:r>
+          <m:t>M</m:t>
+        </m:r>
+      </m:oMath>
+      <w:r>
+        <w:t xml:space="preserve">, i.e. the angular-moment</w:t>
+      </w:r>
+      <w:r>
+        <w:t xml:space="preserve"> </w:t>
+      </w:r>
+      <w:r>
+        <w:t xml:space="preserve">closure is still the dominant residual, and the square tiling does not</w:t>
+      </w:r>
+      <w:r>
+        <w:t xml:space="preserve"> </w:t>
+      </w:r>
+      <w:r>
+        <w:t xml:space="preserve">remove the systematic low bias. Figure </w:t>
+      </w:r>
+      <w:hyperlink w:anchor="fig:rectflux">
+        <w:r>
+          <w:rPr>
+            <w:rStyle w:val="Hyperlink"/>
+          </w:rPr>
+          <w:t xml:space="preserve">5</w:t>
+        </w:r>
+      </w:hyperlink>
+      <w:r>
+        <w:t xml:space="preserve"> </w:t>
+      </w:r>
+      <w:r>
+        <w:t xml:space="preserve">compares the two</w:t>
+      </w:r>
+      <w:r>
+        <w:t xml:space="preserve"> </w:t>
+      </w:r>
+      <w:r>
+        <w:t xml:space="preserve">solvers on this identical geometry. The pin-by-pin fission maps</w:t>
+      </w:r>
+      <w:r>
+        <w:t xml:space="preserve"> </w:t>
+      </w:r>
+      <m:oMath>
+        <m:sSub>
+          <m:e>
+            <m:r>
+              <m:rPr>
+                <m:sty m:val="p"/>
+              </m:rPr>
+              <m:t>Σ</m:t>
+            </m:r>
+          </m:e>
+          <m:sub>
+            <m:r>
+              <m:t>f</m:t>
+            </m:r>
+          </m:sub>
+        </m:sSub>
+        <m:r>
+          <m:t>ϕ</m:t>
+        </m:r>
+      </m:oMath>
+      <w:r>
+        <w:t xml:space="preserve"> </w:t>
+      </w:r>
+      <w:r>
+        <w:t xml:space="preserve">agree with a mean of</w:t>
+      </w:r>
+      <w:r>
+        <w:t xml:space="preserve"> </w:t>
+      </w:r>
+      <m:oMath>
+        <m:r>
+          <m:rPr>
+            <m:sty m:val="p"/>
+          </m:rPr>
+          <m:t>−</m:t>
+        </m:r>
+        <m:r>
+          <m:t>0.00</m:t>
+        </m:r>
+        <m:r>
+          <m:rPr>
+            <m:sty m:val="p"/>
+          </m:rPr>
+          <m:t>%</m:t>
+        </m:r>
+      </m:oMath>
+      <w:r>
+        <w:t xml:space="preserve"> </w:t>
+      </w:r>
+      <w:r>
+        <w:t xml:space="preserve">and an RMS of</w:t>
+      </w:r>
+      <w:r>
+        <w:t xml:space="preserve"> </w:t>
+      </w:r>
+      <m:oMath>
+        <m:r>
+          <m:t>0.16</m:t>
+        </m:r>
+        <m:r>
+          <m:rPr>
+            <m:sty m:val="p"/>
+          </m:rPr>
+          <m:t>%</m:t>
+        </m:r>
+      </m:oMath>
+      <w:r>
+        <w:t xml:space="preserve"> </w:t>
+      </w:r>
+      <w:r>
+        <w:t xml:space="preserve">(max</w:t>
+      </w:r>
+      <w:r>
+        <w:t xml:space="preserve"> </w:t>
+      </w:r>
+      <m:oMath>
+        <m:r>
+          <m:t>0.38</m:t>
+        </m:r>
+        <m:r>
+          <m:rPr>
+            <m:sty m:val="p"/>
+          </m:rPr>
+          <m:t>%</m:t>
+        </m:r>
+      </m:oMath>
+      <w:r>
+        <w:t xml:space="preserve">) on the assembly, and a mean of</w:t>
+      </w:r>
+      <w:r>
+        <w:t xml:space="preserve"> </w:t>
+      </w:r>
+      <m:oMath>
+        <m:r>
+          <m:rPr>
+            <m:sty m:val="p"/>
+          </m:rPr>
+          <m:t>−</m:t>
+        </m:r>
+        <m:r>
+          <m:t>0.18</m:t>
+        </m:r>
+        <m:r>
+          <m:rPr>
+            <m:sty m:val="p"/>
+          </m:rPr>
+          <m:t>%</m:t>
+        </m:r>
+      </m:oMath>
+      <w:r>
+        <w:t xml:space="preserve"> </w:t>
+      </w:r>
+      <w:r>
+        <w:t xml:space="preserve">and an RMS of</w:t>
+      </w:r>
+      <w:r>
+        <w:t xml:space="preserve"> </w:t>
+      </w:r>
+      <m:oMath>
+        <m:r>
+          <m:t>0.59</m:t>
+        </m:r>
+        <m:r>
+          <m:rPr>
+            <m:sty m:val="p"/>
+          </m:rPr>
+          <m:t>%</m:t>
+        </m:r>
+      </m:oMath>
+      <w:r>
+        <w:t xml:space="preserve"> </w:t>
+      </w:r>
+      <w:r>
+        <w:t xml:space="preserve">(max</w:t>
+      </w:r>
+      <w:r>
+        <w:t xml:space="preserve"> </w:t>
+      </w:r>
+      <m:oMath>
+        <m:r>
+          <m:t>1.61</m:t>
+        </m:r>
+        <m:r>
+          <m:rPr>
+            <m:sty m:val="p"/>
+          </m:rPr>
+          <m:t>%</m:t>
+        </m:r>
+      </m:oMath>
+      <w:r>
+        <w:t xml:space="preserve">) over all</w:t>
+      </w:r>
+      <w:r>
+        <w:t xml:space="preserve"> </w:t>
+      </w:r>
+      <m:oMath>
+        <m:r>
+          <m:t>1056</m:t>
+        </m:r>
+      </m:oMath>
+      <w:r>
+        <w:t xml:space="preserve"> </w:t>
+      </w:r>
+      <w:r>
+        <w:t xml:space="preserve">fuel pins of the 1/4 core</w:t>
+      </w:r>
+      <w:r>
+        <w:t xml:space="preserve"> </w:t>
+      </w:r>
+      <w:r>
+        <w:t xml:space="preserve">(assembly means</w:t>
+      </w:r>
+      <w:r>
+        <w:t xml:space="preserve"> </w:t>
+      </w:r>
+      <m:oMath>
+        <m:r>
+          <m:rPr>
+            <m:sty m:val="p"/>
+          </m:rPr>
+          <m:t>+</m:t>
+        </m:r>
+        <m:r>
+          <m:t>0.46</m:t>
+        </m:r>
+        <m:r>
+          <m:rPr>
+            <m:sty m:val="p"/>
+          </m:rPr>
+          <m:t>%</m:t>
+        </m:r>
+      </m:oMath>
+      <w:r>
+        <w:t xml:space="preserve">,</w:t>
+      </w:r>
+      <w:r>
+        <w:t xml:space="preserve"> </w:t>
+      </w:r>
+      <m:oMath>
+        <m:r>
+          <m:rPr>
+            <m:sty m:val="p"/>
+          </m:rPr>
+          <m:t>−</m:t>
+        </m:r>
+        <m:r>
+          <m:t>0.64</m:t>
+        </m:r>
+        <m:r>
+          <m:rPr>
+            <m:sty m:val="p"/>
+          </m:rPr>
+          <m:t>%</m:t>
+        </m:r>
+      </m:oMath>
+      <w:r>
+        <w:t xml:space="preserve">,</w:t>
+      </w:r>
+      <w:r>
+        <w:t xml:space="preserve"> </w:t>
+      </w:r>
+      <m:oMath>
+        <m:r>
+          <m:rPr>
+            <m:sty m:val="p"/>
+          </m:rPr>
+          <m:t>−</m:t>
+        </m:r>
+        <m:r>
+          <m:t>0.60</m:t>
+        </m:r>
+        <m:r>
+          <m:rPr>
+            <m:sty m:val="p"/>
+          </m:rPr>
+          <m:t>%</m:t>
+        </m:r>
+      </m:oMath>
+      <w:r>
+        <w:t xml:space="preserve">,</w:t>
+      </w:r>
+      <w:r>
+        <w:t xml:space="preserve"> </w:t>
+      </w:r>
+      <m:oMath>
+        <m:r>
+          <m:rPr>
+            <m:sty m:val="p"/>
+          </m:rPr>
+          <m:t>+</m:t>
+        </m:r>
+        <m:r>
+          <m:t>0.05</m:t>
+        </m:r>
+        <m:r>
+          <m:rPr>
+            <m:sty m:val="p"/>
+          </m:rPr>
+          <m:t>%</m:t>
+        </m:r>
+      </m:oMath>
+      <w:r>
+        <w:t xml:space="preserve">): the same</w:t>
+      </w:r>
+      <w:r>
+        <w:t xml:space="preserve"> </w:t>
+      </w:r>
+      <w:r>
+        <w:t xml:space="preserve">level as against the explicit cylindrical geometry (RMS</w:t>
+      </w:r>
+      <w:r>
+        <w:t xml:space="preserve"> </w:t>
+      </w:r>
+      <m:oMath>
+        <m:r>
+          <m:t>0.72</m:t>
+        </m:r>
+        <m:r>
+          <m:rPr>
+            <m:sty m:val="p"/>
+          </m:rPr>
+          <m:t>%</m:t>
+        </m:r>
+      </m:oMath>
+      <w:r>
+        <w:t xml:space="preserve">), so the</w:t>
+      </w:r>
+      <w:r>
+        <w:t xml:space="preserve"> </w:t>
+      </w:r>
+      <w:r>
+        <w:t xml:space="preserve">pin-level shape difference is set by the method, not by the square tiling.</w:t>
+      </w:r>
+    </w:p>
+    <w:bookmarkStart w:id="47" w:name="fig:rectflux"/>
+    <w:p>
+      <w:pPr>
+        <w:pStyle w:val="CaptionedFigure"/>
+      </w:pPr>
+      <w:r>
+        <w:drawing>
+          <wp:inline>
+            <wp:extent cx="5227320" cy="3217842"/>
+            <wp:effectExtent b="0" l="0" r="0" t="0"/>
+            <wp:docPr descr="" title="" id="45" name="Picture"/>
+            <a:graphic>
+              <a:graphicData uri="http://schemas.openxmlformats.org/drawingml/2006/picture">
+                <pic:pic>
+                  <pic:nvPicPr>
+                    <pic:cNvPr descr="c5g7_rect_vs_rect_flux.png" id="46" name="Picture"/>
+                    <pic:cNvPicPr>
+                      <a:picLocks noChangeArrowheads="1" noChangeAspect="1"/>
+                    </pic:cNvPicPr>
+                  </pic:nvPicPr>
+                  <pic:blipFill>
+                    <a:blip r:embed="rId44"/>
+                    <a:stretch>
+                      <a:fillRect/>
+                    </a:stretch>
+                  </pic:blipFill>
+                  <pic:spPr bwMode="auto">
+                    <a:xfrm>
+                      <a:off x="0" y="0"/>
+                      <a:ext cx="5227320" cy="3217842"/>
+                    </a:xfrm>
+                    <a:prstGeom prst="rect">
+                      <a:avLst/>
+                    </a:prstGeom>
+                    <a:noFill/>
+                    <a:ln w="9525">
+                      <a:noFill/>
+                      <a:headEnd/>
+                      <a:tailEnd/>
+                    </a:ln>
+                  </pic:spPr>
+                </pic:pic>
+              </a:graphicData>
+            </a:graphic>
+          </wp:inline>
+        </w:drawing>
+      </w:r>
+    </w:p>
+    <w:p>
+      <w:pPr>
+        <w:pStyle w:val="ImageCaption"/>
+      </w:pPr>
+      <w:r>
+        <w:t xml:space="preserve">Pin-averaged fission maps</w:t>
+      </w:r>
+      <w:r>
+        <w:t xml:space="preserve"> </w:t>
+      </w:r>
+      <m:oMath>
+        <m:sSub>
+          <m:e>
+            <m:r>
+              <m:rPr>
+                <m:sty m:val="p"/>
+              </m:rPr>
+              <m:t>Σ</m:t>
+            </m:r>
+          </m:e>
+          <m:sub>
+            <m:r>
+              <m:t>f</m:t>
+            </m:r>
+          </m:sub>
+        </m:sSub>
+        <m:r>
+          <m:t>ϕ</m:t>
+        </m:r>
+      </m:oMath>
+      <w:r>
+        <w:t xml:space="preserve">, rectangular-node</w:t>
+      </w:r>
+      <w:r>
+        <w:t xml:space="preserve"> </w:t>
+      </w:r>
+      <w:r>
+        <w:t xml:space="preserve">OpenPSN (</w:t>
+      </w:r>
+      <m:oMath>
+        <m:r>
+          <m:t>M</m:t>
+        </m:r>
+        <m:r>
+          <m:rPr>
+            <m:sty m:val="p"/>
+          </m:rPr>
+          <m:t>=</m:t>
+        </m:r>
+        <m:r>
+          <m:t>16</m:t>
+        </m:r>
+      </m:oMath>
+      <w:r>
+        <w:t xml:space="preserve">) vs. OpenMC on the identical rectangular-rod geometry</w:t>
+      </w:r>
+      <w:r>
+        <w:t xml:space="preserve"> </w:t>
+      </w:r>
+      <w:r>
+        <w:t xml:space="preserve">(equal-area square fuel block per pin cell, 7-group collision estimator).</w:t>
+      </w:r>
+      <w:r>
+        <w:t xml:space="preserve"> </w:t>
+      </w:r>
+      <w:r>
+        <w:t xml:space="preserve">One row per problem — single UO</w:t>
+      </w:r>
+      <m:oMath>
+        <m:sSub>
+          <m:e>
+            <m:r>
+              <m:t>​</m:t>
+            </m:r>
+          </m:e>
+          <m:sub>
+            <m:r>
+              <m:t>2</m:t>
+            </m:r>
+          </m:sub>
+        </m:sSub>
+      </m:oMath>
+      <w:r>
+        <w:t xml:space="preserve"> </w:t>
+      </w:r>
+      <w:r>
+        <w:t xml:space="preserve">assembly (17</w:t>
+      </w:r>
+      <m:oMath>
+        <m:r>
+          <m:rPr>
+            <m:sty m:val="p"/>
+          </m:rPr>
+          <m:t>×</m:t>
+        </m:r>
+      </m:oMath>
+      <w:r>
+        <w:t xml:space="preserve">17 pins), then</w:t>
+      </w:r>
+      <w:r>
+        <w:t xml:space="preserve"> </w:t>
+      </w:r>
+      <w:r>
+        <w:t xml:space="preserve">C5G7-2D 1/4 core, fuel region only (34</w:t>
+      </w:r>
+      <m:oMath>
+        <m:r>
+          <m:rPr>
+            <m:sty m:val="p"/>
+          </m:rPr>
+          <m:t>×</m:t>
+        </m:r>
+      </m:oMath>
+      <w:r>
+        <w:t xml:space="preserve">34 pins); columns are</w:t>
+      </w:r>
+      <w:r>
+        <w:t xml:space="preserve"> </w:t>
+      </w:r>
+      <w:r>
+        <w:t xml:space="preserve">OpenPSN, OpenMC, and the pin-by-pin relative error (fuel pins only), both</w:t>
+      </w:r>
+      <w:r>
+        <w:t xml:space="preserve"> </w:t>
+      </w:r>
+      <w:r>
+        <w:t xml:space="preserve">maps normalised to unit sum.</w:t>
+      </w:r>
+    </w:p>
+    <w:bookmarkEnd w:id="47"/>
+    <w:bookmarkEnd w:id="48"/>
+    <w:bookmarkEnd w:id="49"/>
+    <w:bookmarkStart w:id="51" w:name="X5dff4020ce9d23d2cf92dde8b6a9f5e78dfe609"/>
+    <w:p>
+      <w:pPr>
+        <w:pStyle w:val="Heading2"/>
+      </w:pPr>
+      <w:r>
+        <w:t xml:space="preserve">Comparison with the published diffusion / SN / nodal landscape</w:t>
+      </w:r>
+    </w:p>
+    <w:p>
+      <w:pPr>
+        <w:pStyle w:val="FirstParagraph"/>
+      </w:pPr>
+      <w:r>
+        <w:t xml:space="preserve">The original NEA report </w:t>
+      </w:r>
+      <w:r>
+        <w:t xml:space="preserve"> </w:t>
+      </w:r>
+      <w:r>
+        <w:t xml:space="preserve">tabulates 20 deterministic codes on</w:t>
+      </w:r>
+      <w:r>
+        <w:t xml:space="preserve"> </w:t>
+      </w:r>
+      <w:r>
+        <w:t xml:space="preserve">C5G7-2D. Table </w:t>
+      </w:r>
+      <w:hyperlink w:anchor="tab:lit">
+        <w:r>
+          <w:rPr>
+            <w:rStyle w:val="Hyperlink"/>
+          </w:rPr>
+          <w:t xml:space="preserve">4</w:t>
+        </w:r>
+      </w:hyperlink>
+      <w:r>
+        <w:t xml:space="preserve"> </w:t>
+      </w:r>
+      <w:r>
+        <w:t xml:space="preserve">reproduces the diffusion- and nodal-family</w:t>
+      </w:r>
+      <w:r>
+        <w:t xml:space="preserve"> </w:t>
+      </w:r>
+      <w:r>
+        <w:t xml:space="preserve">values we could extract from it, together with recent P1/SP3/SN/nodal</w:t>
+      </w:r>
+      <w:r>
+        <w:t xml:space="preserve"> </w:t>
+      </w:r>
+      <w:r>
+        <w:t xml:space="preserve">literature results and our own OpenPSN result.</w:t>
+      </w:r>
+    </w:p>
+    <w:bookmarkStart w:id="50" w:name="tab:lit"/>
+    <w:p>
+      <w:pPr>
+        <w:pStyle w:val="TableCaption"/>
+      </w:pPr>
+      <w:r>
+        <w:t xml:space="preserve">C5G7-2D</w:t>
+      </w:r>
+      <w:r>
+        <w:t xml:space="preserve"> </w:t>
+      </w:r>
+      <m:oMath>
+        <m:sSub>
+          <m:e>
+            <m:r>
+              <m:t>κ</m:t>
+            </m:r>
+          </m:e>
+          <m:sub>
+            <m:r>
+              <m:rPr>
+                <m:sty m:val="p"/>
+              </m:rPr>
+              <m:t>e</m:t>
+            </m:r>
+            <m:r>
+              <m:rPr>
+                <m:sty m:val="p"/>
+              </m:rPr>
+              <m:t>f</m:t>
+            </m:r>
+            <m:r>
+              <m:rPr>
+                <m:sty m:val="p"/>
+              </m:rPr>
+              <m:t>f</m:t>
+            </m:r>
+          </m:sub>
+        </m:sSub>
       </m:oMath>
       <w:r>
         <w:t xml:space="preserve"> </w:t>
@@ -13004,7 +14261,7 @@
         </w:tc>
       </w:tr>
     </w:tbl>
-    <w:bookmarkEnd w:id="44"/>
+    <w:bookmarkEnd w:id="50"/>
     <w:p>
       <w:pPr>
         <w:pStyle w:val="BodyText"/>
@@ -13805,7 +15062,41 @@
         <w:t xml:space="preserve"> </w:t>
       </w:r>
       <w:r>
-        <w:t xml:space="preserve">(inside its Monte Carlo standard error) and</w:t>
+        <w:t xml:space="preserve">(</w:t>
+      </w:r>
+      <m:oMath>
+        <m:r>
+          <m:rPr>
+            <m:sty m:val="p"/>
+          </m:rPr>
+          <m:t>∼</m:t>
+        </m:r>
+        <m:r>
+          <m:t>3.3</m:t>
+        </m:r>
+      </m:oMath>
+      <w:r>
+        <w:t xml:space="preserve"> </w:t>
+      </w:r>
+      <w:r>
+        <w:t xml:space="preserve">its</w:t>
+      </w:r>
+      <w:r>
+        <w:t xml:space="preserve"> </w:t>
+      </w:r>
+      <m:oMath>
+        <m:r>
+          <m:rPr>
+            <m:sty m:val="p"/>
+          </m:rPr>
+          <m:t>±</m:t>
+        </m:r>
+        <m:r>
+          <m:t>3.4</m:t>
+        </m:r>
+      </m:oMath>
+      <w:r>
+        <w:t xml:space="preserve"> pcm standard error) and</w:t>
       </w:r>
       <w:r>
         <w:t xml:space="preserve"> </w:t>
@@ -13830,7 +15121,62 @@
         </m:r>
       </m:oMath>
       <w:r>
-        <w:t xml:space="preserve">.</w:t>
+        <w:t xml:space="preserve">,</w:t>
+      </w:r>
+      <w:r>
+        <w:t xml:space="preserve"> </w:t>
+      </w:r>
+      <w:r>
+        <w:t xml:space="preserve">and at</w:t>
+      </w:r>
+      <w:r>
+        <w:t xml:space="preserve"> </w:t>
+      </w:r>
+      <m:oMath>
+        <m:r>
+          <m:rPr>
+            <m:sty m:val="p"/>
+          </m:rPr>
+          <m:t>−</m:t>
+        </m:r>
+        <m:r>
+          <m:t>61.1</m:t>
+        </m:r>
+      </m:oMath>
+      <w:r>
+        <w:t xml:space="preserve"> pcm vs. the OpenMC run on the identical</w:t>
+      </w:r>
+      <w:r>
+        <w:t xml:space="preserve"> </w:t>
+      </w:r>
+      <w:r>
+        <w:t xml:space="preserve">rectangular-rod geometry (Section 4.4); the pin-level fission maps agree</w:t>
+      </w:r>
+      <w:r>
+        <w:t xml:space="preserve"> </w:t>
+      </w:r>
+      <w:r>
+        <w:t xml:space="preserve">within</w:t>
+      </w:r>
+      <w:r>
+        <w:t xml:space="preserve"> </w:t>
+      </w:r>
+      <m:oMath>
+        <m:r>
+          <m:t>0.6</m:t>
+        </m:r>
+        <m:r>
+          <m:rPr>
+            <m:sty m:val="p"/>
+          </m:rPr>
+          <m:t>%</m:t>
+        </m:r>
+      </m:oMath>
+      <w:r>
+        <w:t xml:space="preserve"> </w:t>
+      </w:r>
+      <w:r>
+        <w:t xml:space="preserve">RMS on both geometries.</w:t>
       </w:r>
       <w:r>
         <w:t xml:space="preserve"> </w:t>
@@ -13968,9 +15314,9 @@
         <w:t xml:space="preserve">their respective current/transport approximations.</w:t>
       </w:r>
     </w:p>
-    <w:bookmarkEnd w:id="45"/>
-    <w:bookmarkEnd w:id="46"/>
-    <w:bookmarkStart w:id="47" w:name="conclusions"/>
+    <w:bookmarkEnd w:id="51"/>
+    <w:bookmarkEnd w:id="52"/>
+    <w:bookmarkStart w:id="53" w:name="conclusions"/>
     <w:p>
       <w:pPr>
         <w:pStyle w:val="Heading1"/>
@@ -14700,8 +16046,8 @@
         <w:t xml:space="preserve">of discrete-ordinates or characteristics methods.</w:t>
       </w:r>
     </w:p>
-    <w:bookmarkEnd w:id="47"/>
-    <w:bookmarkStart w:id="54" w:name="acknowledgments"/>
+    <w:bookmarkEnd w:id="53"/>
+    <w:bookmarkStart w:id="60" w:name="acknowledgments"/>
     <w:p>
       <w:pPr>
         <w:pStyle w:val="Heading1"/>
@@ -14795,7 +16141,7 @@
       <w:r>
         <w:t xml:space="preserve"> </w:t>
       </w:r>
-      <w:hyperlink r:id="rId48">
+      <w:hyperlink r:id="rId54">
         <w:r>
           <w:rPr>
             <w:rStyle w:val="Hyperlink"/>
@@ -14905,7 +16251,7 @@
       <w:r>
         <w:t xml:space="preserve">107–118  </w:t>
       </w:r>
-      <w:hyperlink r:id="rId49">
+      <w:hyperlink r:id="rId55">
         <w:r>
           <w:rPr>
             <w:rStyle w:val="Hyperlink"/>
@@ -14968,7 +16314,7 @@
       <w:r>
         <w:t xml:space="preserve">(2017) 177–189  </w:t>
       </w:r>
-      <w:hyperlink r:id="rId50">
+      <w:hyperlink r:id="rId56">
         <w:r>
           <w:rPr>
             <w:rStyle w:val="Hyperlink"/>
@@ -15213,7 +16559,7 @@
       <w:r>
         <w:t xml:space="preserve">1403–1415  </w:t>
       </w:r>
-      <w:hyperlink r:id="rId51">
+      <w:hyperlink r:id="rId57">
         <w:r>
           <w:rPr>
             <w:rStyle w:val="Hyperlink"/>
@@ -15395,7 +16741,7 @@
       <w:r>
         <w:t xml:space="preserve">90–97  </w:t>
       </w:r>
-      <w:hyperlink r:id="rId52">
+      <w:hyperlink r:id="rId58">
         <w:r>
           <w:rPr>
             <w:rStyle w:val="Hyperlink"/>
@@ -15536,7 +16882,7 @@
       <w:r>
         <w:t xml:space="preserve">1013–1020  </w:t>
       </w:r>
-      <w:hyperlink r:id="rId53">
+      <w:hyperlink r:id="rId59">
         <w:r>
           <w:rPr>
             <w:rStyle w:val="Hyperlink"/>
@@ -15548,8 +16894,8 @@
         <w:t xml:space="preserve">.</w:t>
       </w:r>
     </w:p>
-    <w:bookmarkEnd w:id="54"/>
-    <w:bookmarkStart w:id="59" w:name="X9a75b1906afddb1a9ab52c7b6459e9b0d4627f9"/>
+    <w:bookmarkEnd w:id="60"/>
+    <w:bookmarkStart w:id="65" w:name="X9a75b1906afddb1a9ab52c7b6459e9b0d4627f9"/>
     <w:p>
       <w:pPr>
         <w:pStyle w:val="Heading1"/>
@@ -15735,7 +17081,7 @@
         <w:t xml:space="preserve">.</w:t>
       </w:r>
     </w:p>
-    <w:bookmarkStart w:id="55" w:name="tab:appA"/>
+    <w:bookmarkStart w:id="61" w:name="tab:appA"/>
     <w:p>
       <w:pPr>
         <w:pStyle w:val="TableCaption"/>
@@ -19806,7 +21152,7 @@
         </w:tc>
       </w:tr>
     </w:tbl>
-    <w:bookmarkEnd w:id="55"/>
+    <w:bookmarkEnd w:id="61"/>
     <w:p>
       <w:pPr>
         <w:pStyle w:val="BodyText"/>
@@ -19895,7 +21241,7 @@
         <w:t xml:space="preserve"> pcm reading uncertainty).</w:t>
       </w:r>
     </w:p>
-    <w:bookmarkStart w:id="56" w:name="tab:appB"/>
+    <w:bookmarkStart w:id="62" w:name="tab:appB"/>
     <w:p>
       <w:pPr>
         <w:pStyle w:val="TableCaption"/>
@@ -23960,7 +25306,7 @@
         </w:tc>
       </w:tr>
     </w:tbl>
-    <w:bookmarkEnd w:id="56"/>
+    <w:bookmarkEnd w:id="62"/>
     <w:p>
       <w:pPr>
         <w:pStyle w:val="BodyText"/>
@@ -24049,7 +25395,7 @@
         <w:t xml:space="preserve"> pcm reading uncertainty).</w:t>
       </w:r>
     </w:p>
-    <w:bookmarkStart w:id="57" w:name="tab:appC"/>
+    <w:bookmarkStart w:id="63" w:name="tab:appC"/>
     <w:p>
       <w:pPr>
         <w:pStyle w:val="TableCaption"/>
@@ -27861,7 +29207,7 @@
         </w:tc>
       </w:tr>
     </w:tbl>
-    <w:bookmarkEnd w:id="57"/>
+    <w:bookmarkEnd w:id="63"/>
     <w:p>
       <w:pPr>
         <w:pStyle w:val="BodyText"/>
@@ -27950,7 +29296,7 @@
         <w:t xml:space="preserve"> pcm reading uncertainty).</w:t>
       </w:r>
     </w:p>
-    <w:bookmarkStart w:id="58" w:name="tab:appD"/>
+    <w:bookmarkStart w:id="64" w:name="tab:appD"/>
     <w:p>
       <w:pPr>
         <w:pStyle w:val="TableCaption"/>
@@ -29136,7 +30482,7 @@
         </w:tc>
       </w:tr>
     </w:tbl>
-    <w:bookmarkEnd w:id="58"/>
+    <w:bookmarkEnd w:id="64"/>
     <w:p>
       <w:pPr>
         <w:pStyle w:val="BodyText"/>
@@ -29225,7 +30571,7 @@
         <w:t xml:space="preserve"> pcm reading uncertainty).</w:t>
       </w:r>
     </w:p>
-    <w:bookmarkEnd w:id="59"/>
+    <w:bookmarkEnd w:id="65"/>
     <w:sectPr>
       <w:footnotePr>
         <w:numRestart w:val="eachSect"/>

</xml_diff>